<commit_message>
Initial branch commit and redundant file deletion
</commit_message>
<xml_diff>
--- a/quality_documentation/s2_rut_python_requirements.docx
+++ b/quality_documentation/s2_rut_python_requirements.docx
@@ -1,6 +1,6 @@
 
 <file path=word/document.xml><?xml version="1.0" encoding="utf-8"?>
-<w:document xmlns:wpc="http://schemas.microsoft.com/office/word/2010/wordprocessingCanvas" xmlns:cx="http://schemas.microsoft.com/office/drawing/2014/chartex" xmlns:cx1="http://schemas.microsoft.com/office/drawing/2015/9/8/chartex" xmlns:cx2="http://schemas.microsoft.com/office/drawing/2015/10/21/chartex" xmlns:cx3="http://schemas.microsoft.com/office/drawing/2016/5/9/chartex" xmlns:cx4="http://schemas.microsoft.com/office/drawing/2016/5/10/chartex" xmlns:cx5="http://schemas.microsoft.com/office/drawing/2016/5/11/chartex" xmlns:cx6="http://schemas.microsoft.com/office/drawing/2016/5/12/chartex" xmlns:cx7="http://schemas.microsoft.com/office/drawing/2016/5/13/chartex" xmlns:cx8="http://schemas.microsoft.com/office/drawing/2016/5/14/chartex" xmlns:mc="http://schemas.openxmlformats.org/markup-compatibility/2006" xmlns:aink="http://schemas.microsoft.com/office/drawing/2016/ink" xmlns:am3d="http://schemas.microsoft.com/office/drawing/2017/model3d" xmlns:o="urn:schemas-microsoft-com:office:office" xmlns:oel="http://schemas.microsoft.com/office/2019/extlst" xmlns:r="http://schemas.openxmlformats.org/officeDocument/2006/relationships" xmlns:m="http://schemas.openxmlformats.org/officeDocument/2006/math" xmlns:v="urn:schemas-microsoft-com:vml" xmlns:wp14="http://schemas.microsoft.com/office/word/2010/wordprocessingDrawing" xmlns:wp="http://schemas.openxmlformats.org/drawingml/2006/wordprocessingDrawing" xmlns:w10="urn:schemas-microsoft-com:office:word" xmlns:w="http://schemas.openxmlformats.org/wordprocessingml/2006/main" xmlns:w14="http://schemas.microsoft.com/office/word/2010/wordml" xmlns:w15="http://schemas.microsoft.com/office/word/2012/wordml" xmlns:w16cex="http://schemas.microsoft.com/office/word/2018/wordml/cex" xmlns:w16cid="http://schemas.microsoft.com/office/word/2016/wordml/cid" xmlns:w16="http://schemas.microsoft.com/office/word/2018/wordml" xmlns:w16sdtdh="http://schemas.microsoft.com/office/word/2020/wordml/sdtdatahash" xmlns:w16se="http://schemas.microsoft.com/office/word/2015/wordml/symex" xmlns:wpg="http://schemas.microsoft.com/office/word/2010/wordprocessingGroup" xmlns:wpi="http://schemas.microsoft.com/office/word/2010/wordprocessingInk" xmlns:wne="http://schemas.microsoft.com/office/word/2006/wordml" xmlns:wps="http://schemas.microsoft.com/office/word/2010/wordprocessingShape" mc:Ignorable="w14 w15 w16se w16cid w16 w16cex w16sdtdh wp14">
+<w:document xmlns:wpc="http://schemas.microsoft.com/office/word/2010/wordprocessingCanvas" xmlns:cx="http://schemas.microsoft.com/office/drawing/2014/chartex" xmlns:cx1="http://schemas.microsoft.com/office/drawing/2015/9/8/chartex" xmlns:cx2="http://schemas.microsoft.com/office/drawing/2015/10/21/chartex" xmlns:cx3="http://schemas.microsoft.com/office/drawing/2016/5/9/chartex" xmlns:cx4="http://schemas.microsoft.com/office/drawing/2016/5/10/chartex" xmlns:cx5="http://schemas.microsoft.com/office/drawing/2016/5/11/chartex" xmlns:cx6="http://schemas.microsoft.com/office/drawing/2016/5/12/chartex" xmlns:cx7="http://schemas.microsoft.com/office/drawing/2016/5/13/chartex" xmlns:cx8="http://schemas.microsoft.com/office/drawing/2016/5/14/chartex" xmlns:mc="http://schemas.openxmlformats.org/markup-compatibility/2006" xmlns:aink="http://schemas.microsoft.com/office/drawing/2016/ink" xmlns:am3d="http://schemas.microsoft.com/office/drawing/2017/model3d" xmlns:o="urn:schemas-microsoft-com:office:office" xmlns:r="http://schemas.openxmlformats.org/officeDocument/2006/relationships" xmlns:m="http://schemas.openxmlformats.org/officeDocument/2006/math" xmlns:v="urn:schemas-microsoft-com:vml" xmlns:wp14="http://schemas.microsoft.com/office/word/2010/wordprocessingDrawing" xmlns:wp="http://schemas.openxmlformats.org/drawingml/2006/wordprocessingDrawing" xmlns:w10="urn:schemas-microsoft-com:office:word" xmlns:w="http://schemas.openxmlformats.org/wordprocessingml/2006/main" xmlns:w14="http://schemas.microsoft.com/office/word/2010/wordml" xmlns:w15="http://schemas.microsoft.com/office/word/2012/wordml" xmlns:w16cex="http://schemas.microsoft.com/office/word/2018/wordml/cex" xmlns:w16cid="http://schemas.microsoft.com/office/word/2016/wordml/cid" xmlns:w16="http://schemas.microsoft.com/office/word/2018/wordml" xmlns:w16sdtdh="http://schemas.microsoft.com/office/word/2020/wordml/sdtdatahash" xmlns:w16se="http://schemas.microsoft.com/office/word/2015/wordml/symex" xmlns:wpg="http://schemas.microsoft.com/office/word/2010/wordprocessingGroup" xmlns:wpi="http://schemas.microsoft.com/office/word/2010/wordprocessingInk" xmlns:wne="http://schemas.microsoft.com/office/word/2006/wordml" xmlns:wps="http://schemas.microsoft.com/office/word/2010/wordprocessingShape" mc:Ignorable="w14 w15 w16se w16cid w16 w16cex w16sdtdh wp14">
   <w:body>
     <w:p>
       <w:pPr>
@@ -170,21 +170,8 @@
               <w:jc w:val="both"/>
             </w:pPr>
             <w:r>
-              <w:t xml:space="preserve">Sam Hunt, </w:t>
+              <w:t>Sam Hunt, Mattea Goalen</w:t>
             </w:r>
-            <w:proofErr w:type="spellStart"/>
-            <w:r>
-              <w:t>Mattea</w:t>
-            </w:r>
-            <w:proofErr w:type="spellEnd"/>
-            <w:r>
-              <w:t xml:space="preserve"> </w:t>
-            </w:r>
-            <w:proofErr w:type="spellStart"/>
-            <w:r>
-              <w:t>Goalen</w:t>
-            </w:r>
-            <w:proofErr w:type="spellEnd"/>
           </w:p>
         </w:tc>
       </w:tr>
@@ -748,7 +735,23 @@
         <w:rPr>
           <w:rFonts w:cs="Arial"/>
         </w:rPr>
-        <w:t>User Requirements</w:t>
+        <w:t xml:space="preserve">User </w:t>
+      </w:r>
+      <w:commentRangeStart w:id="10"/>
+      <w:r>
+        <w:rPr>
+          <w:rFonts w:cs="Arial"/>
+        </w:rPr>
+        <w:t>Requirements</w:t>
+      </w:r>
+      <w:commentRangeEnd w:id="10"/>
+      <w:r>
+        <w:rPr>
+          <w:rStyle w:val="CommentReference"/>
+          <w:rFonts w:ascii="Calibri" w:hAnsi="Calibri"/>
+          <w:b w:val="0"/>
+        </w:rPr>
+        <w:commentReference w:id="10"/>
       </w:r>
     </w:p>
     <w:p>
@@ -983,7 +986,7 @@
           <w:color w:val="4472C4" w:themeColor="accent1"/>
         </w:rPr>
       </w:pPr>
-      <w:bookmarkStart w:id="10" w:name="_Toc144034947"/>
+      <w:bookmarkStart w:id="11" w:name="_Toc144034947"/>
       <w:r>
         <w:rPr>
           <w:rFonts w:cs="Arial"/>
@@ -995,7 +998,7 @@
         </w:rPr>
         <w:t xml:space="preserve">[Critical] </w:t>
       </w:r>
-      <w:bookmarkEnd w:id="10"/>
+      <w:bookmarkEnd w:id="11"/>
     </w:p>
     <w:p>
       <w:pPr>
@@ -1066,11 +1069,11 @@
           <w:color w:val="4472C4" w:themeColor="accent1"/>
         </w:rPr>
       </w:pPr>
-      <w:bookmarkStart w:id="11" w:name="_Toc143952722"/>
-      <w:bookmarkStart w:id="12" w:name="_Toc143953806"/>
-      <w:bookmarkStart w:id="13" w:name="_Ref144014442"/>
-      <w:bookmarkStart w:id="14" w:name="_Ref144015253"/>
-      <w:bookmarkStart w:id="15" w:name="_Toc144034961"/>
+      <w:bookmarkStart w:id="12" w:name="_Toc143952722"/>
+      <w:bookmarkStart w:id="13" w:name="_Toc143953806"/>
+      <w:bookmarkStart w:id="14" w:name="_Ref144014442"/>
+      <w:bookmarkStart w:id="15" w:name="_Ref144015253"/>
+      <w:bookmarkStart w:id="16" w:name="_Toc144034961"/>
       <w:r>
         <w:rPr>
           <w:rFonts w:cs="Arial"/>
@@ -1104,11 +1107,11 @@
         </w:rPr>
         <w:t xml:space="preserve">] </w:t>
       </w:r>
-      <w:bookmarkEnd w:id="11"/>
       <w:bookmarkEnd w:id="12"/>
       <w:bookmarkEnd w:id="13"/>
       <w:bookmarkEnd w:id="14"/>
       <w:bookmarkEnd w:id="15"/>
+      <w:bookmarkEnd w:id="16"/>
       <w:r>
         <w:rPr>
           <w:rFonts w:cs="Arial"/>
@@ -1183,7 +1186,27 @@
           <w:bCs w:val="0"/>
           <w:color w:val="4472C4" w:themeColor="accent1"/>
         </w:rPr>
-        <w:t xml:space="preserve"> as obsarray with appended uncertainty variables with error-correlation metadata.</w:t>
+        <w:t xml:space="preserve"> as </w:t>
+      </w:r>
+      <w:proofErr w:type="spellStart"/>
+      <w:r>
+        <w:rPr>
+          <w:rFonts w:cs="Arial"/>
+          <w:b w:val="0"/>
+          <w:bCs w:val="0"/>
+          <w:color w:val="4472C4" w:themeColor="accent1"/>
+        </w:rPr>
+        <w:t>obsarray</w:t>
+      </w:r>
+      <w:proofErr w:type="spellEnd"/>
+      <w:r>
+        <w:rPr>
+          <w:rFonts w:cs="Arial"/>
+          <w:b w:val="0"/>
+          <w:bCs w:val="0"/>
+          <w:color w:val="4472C4" w:themeColor="accent1"/>
+        </w:rPr>
+        <w:t xml:space="preserve"> with appended uncertainty variables with error-correlation metadata.</w:t>
       </w:r>
     </w:p>
     <w:p>
@@ -1452,16 +1475,7 @@
           <w:bCs w:val="0"/>
           <w:color w:val="4472C4" w:themeColor="accent1"/>
         </w:rPr>
-        <w:t>Output should be built as obsarray</w:t>
-      </w:r>
-      <w:r>
-        <w:rPr>
-          <w:rFonts w:cs="Arial"/>
-          <w:b w:val="0"/>
-          <w:bCs w:val="0"/>
-          <w:color w:val="4472C4" w:themeColor="accent1"/>
-        </w:rPr>
-        <w:t>, containing uncertainty variables and error-correlation metadata. Should be in units of reflectance.</w:t>
+        <w:t>Output should be built as obsarray, containing uncertainty variables and error-correlation metadata. Should be in units of reflectance.</w:t>
       </w:r>
     </w:p>
     <w:p>
@@ -1558,9 +1572,9 @@
           <w:color w:val="4472C4" w:themeColor="accent1"/>
         </w:rPr>
       </w:pPr>
-      <w:bookmarkStart w:id="16" w:name="_Toc143952736"/>
-      <w:bookmarkStart w:id="17" w:name="_Toc143953820"/>
-      <w:bookmarkStart w:id="18" w:name="_Toc144034975"/>
+      <w:bookmarkStart w:id="17" w:name="_Toc143952736"/>
+      <w:bookmarkStart w:id="18" w:name="_Toc143953820"/>
+      <w:bookmarkStart w:id="19" w:name="_Toc144034975"/>
       <w:r>
         <w:rPr>
           <w:rFonts w:cs="Arial"/>
@@ -1600,9 +1614,9 @@
         </w:rPr>
         <w:t xml:space="preserve"> </w:t>
       </w:r>
-      <w:bookmarkEnd w:id="16"/>
       <w:bookmarkEnd w:id="17"/>
       <w:bookmarkEnd w:id="18"/>
+      <w:bookmarkEnd w:id="19"/>
       <w:r>
         <w:rPr>
           <w:rFonts w:cs="Arial"/>
@@ -1869,16 +1883,7 @@
           <w:bCs w:val="0"/>
           <w:color w:val="4472C4" w:themeColor="accent1"/>
         </w:rPr>
-        <w:t>Keep snap-rut submodule up to date</w:t>
-      </w:r>
-      <w:r>
-        <w:rPr>
-          <w:rFonts w:cs="Arial"/>
-          <w:b w:val="0"/>
-          <w:bCs w:val="0"/>
-          <w:color w:val="4472C4" w:themeColor="accent1"/>
-        </w:rPr>
-        <w:t>.</w:t>
+        <w:t>Keep snap-rut submodule up to date.</w:t>
       </w:r>
     </w:p>
     <w:p>
@@ -2331,12 +2336,12 @@
     </w:p>
     <w:p/>
     <w:sectPr>
-      <w:headerReference w:type="even" r:id="rId11"/>
-      <w:headerReference w:type="default" r:id="rId12"/>
-      <w:footerReference w:type="even" r:id="rId13"/>
-      <w:footerReference w:type="default" r:id="rId14"/>
-      <w:headerReference w:type="first" r:id="rId15"/>
-      <w:footerReference w:type="first" r:id="rId16"/>
+      <w:headerReference w:type="even" r:id="rId15"/>
+      <w:headerReference w:type="default" r:id="rId16"/>
+      <w:footerReference w:type="even" r:id="rId17"/>
+      <w:footerReference w:type="default" r:id="rId18"/>
+      <w:headerReference w:type="first" r:id="rId19"/>
+      <w:footerReference w:type="first" r:id="rId20"/>
       <w:pgSz w:w="11906" w:h="16838"/>
       <w:pgMar w:top="1276" w:right="1440" w:bottom="1440" w:left="1440" w:header="708" w:footer="708" w:gutter="0"/>
       <w:cols w:space="708"/>
@@ -2346,8 +2351,47 @@
 </w:document>
 </file>
 
+<file path=word/comments.xml><?xml version="1.0" encoding="utf-8"?>
+<w:comments xmlns:wpc="http://schemas.microsoft.com/office/word/2010/wordprocessingCanvas" xmlns:cx="http://schemas.microsoft.com/office/drawing/2014/chartex" xmlns:cx1="http://schemas.microsoft.com/office/drawing/2015/9/8/chartex" xmlns:cx2="http://schemas.microsoft.com/office/drawing/2015/10/21/chartex" xmlns:cx3="http://schemas.microsoft.com/office/drawing/2016/5/9/chartex" xmlns:cx4="http://schemas.microsoft.com/office/drawing/2016/5/10/chartex" xmlns:cx5="http://schemas.microsoft.com/office/drawing/2016/5/11/chartex" xmlns:cx6="http://schemas.microsoft.com/office/drawing/2016/5/12/chartex" xmlns:cx7="http://schemas.microsoft.com/office/drawing/2016/5/13/chartex" xmlns:cx8="http://schemas.microsoft.com/office/drawing/2016/5/14/chartex" xmlns:mc="http://schemas.openxmlformats.org/markup-compatibility/2006" xmlns:aink="http://schemas.microsoft.com/office/drawing/2016/ink" xmlns:am3d="http://schemas.microsoft.com/office/drawing/2017/model3d" xmlns:o="urn:schemas-microsoft-com:office:office" xmlns:r="http://schemas.openxmlformats.org/officeDocument/2006/relationships" xmlns:m="http://schemas.openxmlformats.org/officeDocument/2006/math" xmlns:v="urn:schemas-microsoft-com:vml" xmlns:wp14="http://schemas.microsoft.com/office/word/2010/wordprocessingDrawing" xmlns:wp="http://schemas.openxmlformats.org/drawingml/2006/wordprocessingDrawing" xmlns:w10="urn:schemas-microsoft-com:office:word" xmlns:w="http://schemas.openxmlformats.org/wordprocessingml/2006/main" xmlns:w14="http://schemas.microsoft.com/office/word/2010/wordml" xmlns:w15="http://schemas.microsoft.com/office/word/2012/wordml" xmlns:w16cex="http://schemas.microsoft.com/office/word/2018/wordml/cex" xmlns:w16cid="http://schemas.microsoft.com/office/word/2016/wordml/cid" xmlns:w16="http://schemas.microsoft.com/office/word/2018/wordml" xmlns:w16sdtdh="http://schemas.microsoft.com/office/word/2020/wordml/sdtdatahash" xmlns:w16se="http://schemas.microsoft.com/office/word/2015/wordml/symex" xmlns:wpg="http://schemas.microsoft.com/office/word/2010/wordprocessingGroup" xmlns:wpi="http://schemas.microsoft.com/office/word/2010/wordprocessingInk" xmlns:wne="http://schemas.microsoft.com/office/word/2006/wordml" xmlns:wps="http://schemas.microsoft.com/office/word/2010/wordprocessingShape" mc:Ignorable="w14 w15 w16se w16cid w16 w16cex w16sdtdh wp14">
+  <w:comment w:id="10" w:author="Mattea Goalen" w:date="2022-10-04T17:18:00Z" w:initials="MG">
+    <w:p>
+      <w:pPr>
+        <w:pStyle w:val="CommentText"/>
+      </w:pPr>
+      <w:r>
+        <w:rPr>
+          <w:rStyle w:val="CommentReference"/>
+        </w:rPr>
+        <w:annotationRef/>
+      </w:r>
+      <w:r>
+        <w:t>Rewrite the bullet points as a comprehensive paragraph</w:t>
+      </w:r>
+    </w:p>
+  </w:comment>
+</w:comments>
+</file>
+
+<file path=word/commentsExtended.xml><?xml version="1.0" encoding="utf-8"?>
+<w15:commentsEx xmlns:wpc="http://schemas.microsoft.com/office/word/2010/wordprocessingCanvas" xmlns:cx="http://schemas.microsoft.com/office/drawing/2014/chartex" xmlns:cx1="http://schemas.microsoft.com/office/drawing/2015/9/8/chartex" xmlns:cx2="http://schemas.microsoft.com/office/drawing/2015/10/21/chartex" xmlns:cx3="http://schemas.microsoft.com/office/drawing/2016/5/9/chartex" xmlns:cx4="http://schemas.microsoft.com/office/drawing/2016/5/10/chartex" xmlns:cx5="http://schemas.microsoft.com/office/drawing/2016/5/11/chartex" xmlns:cx6="http://schemas.microsoft.com/office/drawing/2016/5/12/chartex" xmlns:cx7="http://schemas.microsoft.com/office/drawing/2016/5/13/chartex" xmlns:cx8="http://schemas.microsoft.com/office/drawing/2016/5/14/chartex" xmlns:mc="http://schemas.openxmlformats.org/markup-compatibility/2006" xmlns:aink="http://schemas.microsoft.com/office/drawing/2016/ink" xmlns:am3d="http://schemas.microsoft.com/office/drawing/2017/model3d" xmlns:o="urn:schemas-microsoft-com:office:office" xmlns:r="http://schemas.openxmlformats.org/officeDocument/2006/relationships" xmlns:m="http://schemas.openxmlformats.org/officeDocument/2006/math" xmlns:v="urn:schemas-microsoft-com:vml" xmlns:wp14="http://schemas.microsoft.com/office/word/2010/wordprocessingDrawing" xmlns:wp="http://schemas.openxmlformats.org/drawingml/2006/wordprocessingDrawing" xmlns:w10="urn:schemas-microsoft-com:office:word" xmlns:w="http://schemas.openxmlformats.org/wordprocessingml/2006/main" xmlns:w14="http://schemas.microsoft.com/office/word/2010/wordml" xmlns:w15="http://schemas.microsoft.com/office/word/2012/wordml" xmlns:w16cex="http://schemas.microsoft.com/office/word/2018/wordml/cex" xmlns:w16cid="http://schemas.microsoft.com/office/word/2016/wordml/cid" xmlns:w16="http://schemas.microsoft.com/office/word/2018/wordml" xmlns:w16sdtdh="http://schemas.microsoft.com/office/word/2020/wordml/sdtdatahash" xmlns:w16se="http://schemas.microsoft.com/office/word/2015/wordml/symex" xmlns:wpg="http://schemas.microsoft.com/office/word/2010/wordprocessingGroup" xmlns:wpi="http://schemas.microsoft.com/office/word/2010/wordprocessingInk" xmlns:wne="http://schemas.microsoft.com/office/word/2006/wordml" xmlns:wps="http://schemas.microsoft.com/office/word/2010/wordprocessingShape" mc:Ignorable="w14 w15 w16se w16cid w16 w16cex w16sdtdh wp14">
+  <w15:commentEx w15:paraId="02E56843" w15:done="0"/>
+</w15:commentsEx>
+</file>
+
+<file path=word/commentsExtensible.xml><?xml version="1.0" encoding="utf-8"?>
+<w16cex:commentsExtensible xmlns:wpc="http://schemas.microsoft.com/office/word/2010/wordprocessingCanvas" xmlns:cx="http://schemas.microsoft.com/office/drawing/2014/chartex" xmlns:cx1="http://schemas.microsoft.com/office/drawing/2015/9/8/chartex" xmlns:cx2="http://schemas.microsoft.com/office/drawing/2015/10/21/chartex" xmlns:cx3="http://schemas.microsoft.com/office/drawing/2016/5/9/chartex" xmlns:cx4="http://schemas.microsoft.com/office/drawing/2016/5/10/chartex" xmlns:cx5="http://schemas.microsoft.com/office/drawing/2016/5/11/chartex" xmlns:cx6="http://schemas.microsoft.com/office/drawing/2016/5/12/chartex" xmlns:cx7="http://schemas.microsoft.com/office/drawing/2016/5/13/chartex" xmlns:cx8="http://schemas.microsoft.com/office/drawing/2016/5/14/chartex" xmlns:mc="http://schemas.openxmlformats.org/markup-compatibility/2006" xmlns:aink="http://schemas.microsoft.com/office/drawing/2016/ink" xmlns:am3d="http://schemas.microsoft.com/office/drawing/2017/model3d" xmlns:o="urn:schemas-microsoft-com:office:office" xmlns:r="http://schemas.openxmlformats.org/officeDocument/2006/relationships" xmlns:m="http://schemas.openxmlformats.org/officeDocument/2006/math" xmlns:v="urn:schemas-microsoft-com:vml" xmlns:wp14="http://schemas.microsoft.com/office/word/2010/wordprocessingDrawing" xmlns:wp="http://schemas.openxmlformats.org/drawingml/2006/wordprocessingDrawing" xmlns:w10="urn:schemas-microsoft-com:office:word" xmlns:w="http://schemas.openxmlformats.org/wordprocessingml/2006/main" xmlns:w14="http://schemas.microsoft.com/office/word/2010/wordml" xmlns:w15="http://schemas.microsoft.com/office/word/2012/wordml" xmlns:w16cex="http://schemas.microsoft.com/office/word/2018/wordml/cex" xmlns:w16cid="http://schemas.microsoft.com/office/word/2016/wordml/cid" xmlns:w16="http://schemas.microsoft.com/office/word/2018/wordml" xmlns:w16sdtdh="http://schemas.microsoft.com/office/word/2020/wordml/sdtdatahash" xmlns:w16se="http://schemas.microsoft.com/office/word/2015/wordml/symex" xmlns:wpg="http://schemas.microsoft.com/office/word/2010/wordprocessingGroup" xmlns:wpi="http://schemas.microsoft.com/office/word/2010/wordprocessingInk" xmlns:wne="http://schemas.microsoft.com/office/word/2006/wordml" xmlns:wps="http://schemas.microsoft.com/office/word/2010/wordprocessingShape" mc:Ignorable="w14 w15 w16se w16cid w16 w16cex w16sdtdh wp14">
+  <w16cex:commentExtensible w16cex:durableId="26E6E951" w16cex:dateUtc="2022-10-04T16:18:00Z"/>
+</w16cex:commentsExtensible>
+</file>
+
+<file path=word/commentsIds.xml><?xml version="1.0" encoding="utf-8"?>
+<w16cid:commentsIds xmlns:wpc="http://schemas.microsoft.com/office/word/2010/wordprocessingCanvas" xmlns:cx="http://schemas.microsoft.com/office/drawing/2014/chartex" xmlns:cx1="http://schemas.microsoft.com/office/drawing/2015/9/8/chartex" xmlns:cx2="http://schemas.microsoft.com/office/drawing/2015/10/21/chartex" xmlns:cx3="http://schemas.microsoft.com/office/drawing/2016/5/9/chartex" xmlns:cx4="http://schemas.microsoft.com/office/drawing/2016/5/10/chartex" xmlns:cx5="http://schemas.microsoft.com/office/drawing/2016/5/11/chartex" xmlns:cx6="http://schemas.microsoft.com/office/drawing/2016/5/12/chartex" xmlns:cx7="http://schemas.microsoft.com/office/drawing/2016/5/13/chartex" xmlns:cx8="http://schemas.microsoft.com/office/drawing/2016/5/14/chartex" xmlns:mc="http://schemas.openxmlformats.org/markup-compatibility/2006" xmlns:aink="http://schemas.microsoft.com/office/drawing/2016/ink" xmlns:am3d="http://schemas.microsoft.com/office/drawing/2017/model3d" xmlns:o="urn:schemas-microsoft-com:office:office" xmlns:r="http://schemas.openxmlformats.org/officeDocument/2006/relationships" xmlns:m="http://schemas.openxmlformats.org/officeDocument/2006/math" xmlns:v="urn:schemas-microsoft-com:vml" xmlns:wp14="http://schemas.microsoft.com/office/word/2010/wordprocessingDrawing" xmlns:wp="http://schemas.openxmlformats.org/drawingml/2006/wordprocessingDrawing" xmlns:w10="urn:schemas-microsoft-com:office:word" xmlns:w="http://schemas.openxmlformats.org/wordprocessingml/2006/main" xmlns:w14="http://schemas.microsoft.com/office/word/2010/wordml" xmlns:w15="http://schemas.microsoft.com/office/word/2012/wordml" xmlns:w16cex="http://schemas.microsoft.com/office/word/2018/wordml/cex" xmlns:w16cid="http://schemas.microsoft.com/office/word/2016/wordml/cid" xmlns:w16="http://schemas.microsoft.com/office/word/2018/wordml" xmlns:w16sdtdh="http://schemas.microsoft.com/office/word/2020/wordml/sdtdatahash" xmlns:w16se="http://schemas.microsoft.com/office/word/2015/wordml/symex" xmlns:wpg="http://schemas.microsoft.com/office/word/2010/wordprocessingGroup" xmlns:wpi="http://schemas.microsoft.com/office/word/2010/wordprocessingInk" xmlns:wne="http://schemas.microsoft.com/office/word/2006/wordml" xmlns:wps="http://schemas.microsoft.com/office/word/2010/wordprocessingShape" mc:Ignorable="w14 w15 w16se w16cid w16 w16cex w16sdtdh wp14">
+  <w16cid:commentId w16cid:paraId="02E56843" w16cid:durableId="26E6E951"/>
+</w16cid:commentsIds>
+</file>
+
 <file path=word/endnotes.xml><?xml version="1.0" encoding="utf-8"?>
-<w:endnotes xmlns:wpc="http://schemas.microsoft.com/office/word/2010/wordprocessingCanvas" xmlns:cx="http://schemas.microsoft.com/office/drawing/2014/chartex" xmlns:cx1="http://schemas.microsoft.com/office/drawing/2015/9/8/chartex" xmlns:cx2="http://schemas.microsoft.com/office/drawing/2015/10/21/chartex" xmlns:cx3="http://schemas.microsoft.com/office/drawing/2016/5/9/chartex" xmlns:cx4="http://schemas.microsoft.com/office/drawing/2016/5/10/chartex" xmlns:cx5="http://schemas.microsoft.com/office/drawing/2016/5/11/chartex" xmlns:cx6="http://schemas.microsoft.com/office/drawing/2016/5/12/chartex" xmlns:cx7="http://schemas.microsoft.com/office/drawing/2016/5/13/chartex" xmlns:cx8="http://schemas.microsoft.com/office/drawing/2016/5/14/chartex" xmlns:mc="http://schemas.openxmlformats.org/markup-compatibility/2006" xmlns:aink="http://schemas.microsoft.com/office/drawing/2016/ink" xmlns:am3d="http://schemas.microsoft.com/office/drawing/2017/model3d" xmlns:o="urn:schemas-microsoft-com:office:office" xmlns:oel="http://schemas.microsoft.com/office/2019/extlst" xmlns:r="http://schemas.openxmlformats.org/officeDocument/2006/relationships" xmlns:m="http://schemas.openxmlformats.org/officeDocument/2006/math" xmlns:v="urn:schemas-microsoft-com:vml" xmlns:wp14="http://schemas.microsoft.com/office/word/2010/wordprocessingDrawing" xmlns:wp="http://schemas.openxmlformats.org/drawingml/2006/wordprocessingDrawing" xmlns:w10="urn:schemas-microsoft-com:office:word" xmlns:w="http://schemas.openxmlformats.org/wordprocessingml/2006/main" xmlns:w14="http://schemas.microsoft.com/office/word/2010/wordml" xmlns:w15="http://schemas.microsoft.com/office/word/2012/wordml" xmlns:w16cex="http://schemas.microsoft.com/office/word/2018/wordml/cex" xmlns:w16cid="http://schemas.microsoft.com/office/word/2016/wordml/cid" xmlns:w16="http://schemas.microsoft.com/office/word/2018/wordml" xmlns:w16sdtdh="http://schemas.microsoft.com/office/word/2020/wordml/sdtdatahash" xmlns:w16se="http://schemas.microsoft.com/office/word/2015/wordml/symex" xmlns:wpg="http://schemas.microsoft.com/office/word/2010/wordprocessingGroup" xmlns:wpi="http://schemas.microsoft.com/office/word/2010/wordprocessingInk" xmlns:wne="http://schemas.microsoft.com/office/word/2006/wordml" xmlns:wps="http://schemas.microsoft.com/office/word/2010/wordprocessingShape" mc:Ignorable="w14 w15 w16se w16cid w16 w16cex w16sdtdh wp14">
+<w:endnotes xmlns:wpc="http://schemas.microsoft.com/office/word/2010/wordprocessingCanvas" xmlns:cx="http://schemas.microsoft.com/office/drawing/2014/chartex" xmlns:cx1="http://schemas.microsoft.com/office/drawing/2015/9/8/chartex" xmlns:cx2="http://schemas.microsoft.com/office/drawing/2015/10/21/chartex" xmlns:cx3="http://schemas.microsoft.com/office/drawing/2016/5/9/chartex" xmlns:cx4="http://schemas.microsoft.com/office/drawing/2016/5/10/chartex" xmlns:cx5="http://schemas.microsoft.com/office/drawing/2016/5/11/chartex" xmlns:cx6="http://schemas.microsoft.com/office/drawing/2016/5/12/chartex" xmlns:cx7="http://schemas.microsoft.com/office/drawing/2016/5/13/chartex" xmlns:cx8="http://schemas.microsoft.com/office/drawing/2016/5/14/chartex" xmlns:mc="http://schemas.openxmlformats.org/markup-compatibility/2006" xmlns:aink="http://schemas.microsoft.com/office/drawing/2016/ink" xmlns:am3d="http://schemas.microsoft.com/office/drawing/2017/model3d" xmlns:o="urn:schemas-microsoft-com:office:office" xmlns:r="http://schemas.openxmlformats.org/officeDocument/2006/relationships" xmlns:m="http://schemas.openxmlformats.org/officeDocument/2006/math" xmlns:v="urn:schemas-microsoft-com:vml" xmlns:wp14="http://schemas.microsoft.com/office/word/2010/wordprocessingDrawing" xmlns:wp="http://schemas.openxmlformats.org/drawingml/2006/wordprocessingDrawing" xmlns:w10="urn:schemas-microsoft-com:office:word" xmlns:w="http://schemas.openxmlformats.org/wordprocessingml/2006/main" xmlns:w14="http://schemas.microsoft.com/office/word/2010/wordml" xmlns:w15="http://schemas.microsoft.com/office/word/2012/wordml" xmlns:w16cex="http://schemas.microsoft.com/office/word/2018/wordml/cex" xmlns:w16cid="http://schemas.microsoft.com/office/word/2016/wordml/cid" xmlns:w16="http://schemas.microsoft.com/office/word/2018/wordml" xmlns:w16sdtdh="http://schemas.microsoft.com/office/word/2020/wordml/sdtdatahash" xmlns:w16se="http://schemas.microsoft.com/office/word/2015/wordml/symex" xmlns:wpg="http://schemas.microsoft.com/office/word/2010/wordprocessingGroup" xmlns:wpi="http://schemas.microsoft.com/office/word/2010/wordprocessingInk" xmlns:wne="http://schemas.microsoft.com/office/word/2006/wordml" xmlns:wps="http://schemas.microsoft.com/office/word/2010/wordprocessingShape" mc:Ignorable="w14 w15 w16se w16cid w16 w16cex w16sdtdh wp14">
   <w:endnote w:type="separator" w:id="-1">
     <w:p>
       <w:r>
@@ -2373,7 +2417,7 @@
 </file>
 
 <file path=word/footer1.xml><?xml version="1.0" encoding="utf-8"?>
-<w:ftr xmlns:wpc="http://schemas.microsoft.com/office/word/2010/wordprocessingCanvas" xmlns:cx="http://schemas.microsoft.com/office/drawing/2014/chartex" xmlns:cx1="http://schemas.microsoft.com/office/drawing/2015/9/8/chartex" xmlns:cx2="http://schemas.microsoft.com/office/drawing/2015/10/21/chartex" xmlns:cx3="http://schemas.microsoft.com/office/drawing/2016/5/9/chartex" xmlns:cx4="http://schemas.microsoft.com/office/drawing/2016/5/10/chartex" xmlns:cx5="http://schemas.microsoft.com/office/drawing/2016/5/11/chartex" xmlns:cx6="http://schemas.microsoft.com/office/drawing/2016/5/12/chartex" xmlns:cx7="http://schemas.microsoft.com/office/drawing/2016/5/13/chartex" xmlns:cx8="http://schemas.microsoft.com/office/drawing/2016/5/14/chartex" xmlns:mc="http://schemas.openxmlformats.org/markup-compatibility/2006" xmlns:aink="http://schemas.microsoft.com/office/drawing/2016/ink" xmlns:am3d="http://schemas.microsoft.com/office/drawing/2017/model3d" xmlns:o="urn:schemas-microsoft-com:office:office" xmlns:oel="http://schemas.microsoft.com/office/2019/extlst" xmlns:r="http://schemas.openxmlformats.org/officeDocument/2006/relationships" xmlns:m="http://schemas.openxmlformats.org/officeDocument/2006/math" xmlns:v="urn:schemas-microsoft-com:vml" xmlns:wp14="http://schemas.microsoft.com/office/word/2010/wordprocessingDrawing" xmlns:wp="http://schemas.openxmlformats.org/drawingml/2006/wordprocessingDrawing" xmlns:w10="urn:schemas-microsoft-com:office:word" xmlns:w="http://schemas.openxmlformats.org/wordprocessingml/2006/main" xmlns:w14="http://schemas.microsoft.com/office/word/2010/wordml" xmlns:w15="http://schemas.microsoft.com/office/word/2012/wordml" xmlns:w16cex="http://schemas.microsoft.com/office/word/2018/wordml/cex" xmlns:w16cid="http://schemas.microsoft.com/office/word/2016/wordml/cid" xmlns:w16="http://schemas.microsoft.com/office/word/2018/wordml" xmlns:w16sdtdh="http://schemas.microsoft.com/office/word/2020/wordml/sdtdatahash" xmlns:w16se="http://schemas.microsoft.com/office/word/2015/wordml/symex" xmlns:wpg="http://schemas.microsoft.com/office/word/2010/wordprocessingGroup" xmlns:wpi="http://schemas.microsoft.com/office/word/2010/wordprocessingInk" xmlns:wne="http://schemas.microsoft.com/office/word/2006/wordml" xmlns:wps="http://schemas.microsoft.com/office/word/2010/wordprocessingShape" mc:Ignorable="w14 w15 w16se w16cid w16 w16cex w16sdtdh wp14">
+<w:ftr xmlns:wpc="http://schemas.microsoft.com/office/word/2010/wordprocessingCanvas" xmlns:cx="http://schemas.microsoft.com/office/drawing/2014/chartex" xmlns:cx1="http://schemas.microsoft.com/office/drawing/2015/9/8/chartex" xmlns:cx2="http://schemas.microsoft.com/office/drawing/2015/10/21/chartex" xmlns:cx3="http://schemas.microsoft.com/office/drawing/2016/5/9/chartex" xmlns:cx4="http://schemas.microsoft.com/office/drawing/2016/5/10/chartex" xmlns:cx5="http://schemas.microsoft.com/office/drawing/2016/5/11/chartex" xmlns:cx6="http://schemas.microsoft.com/office/drawing/2016/5/12/chartex" xmlns:cx7="http://schemas.microsoft.com/office/drawing/2016/5/13/chartex" xmlns:cx8="http://schemas.microsoft.com/office/drawing/2016/5/14/chartex" xmlns:mc="http://schemas.openxmlformats.org/markup-compatibility/2006" xmlns:aink="http://schemas.microsoft.com/office/drawing/2016/ink" xmlns:am3d="http://schemas.microsoft.com/office/drawing/2017/model3d" xmlns:o="urn:schemas-microsoft-com:office:office" xmlns:r="http://schemas.openxmlformats.org/officeDocument/2006/relationships" xmlns:m="http://schemas.openxmlformats.org/officeDocument/2006/math" xmlns:v="urn:schemas-microsoft-com:vml" xmlns:wp14="http://schemas.microsoft.com/office/word/2010/wordprocessingDrawing" xmlns:wp="http://schemas.openxmlformats.org/drawingml/2006/wordprocessingDrawing" xmlns:w10="urn:schemas-microsoft-com:office:word" xmlns:w="http://schemas.openxmlformats.org/wordprocessingml/2006/main" xmlns:w14="http://schemas.microsoft.com/office/word/2010/wordml" xmlns:w15="http://schemas.microsoft.com/office/word/2012/wordml" xmlns:w16cex="http://schemas.microsoft.com/office/word/2018/wordml/cex" xmlns:w16cid="http://schemas.microsoft.com/office/word/2016/wordml/cid" xmlns:w16="http://schemas.microsoft.com/office/word/2018/wordml" xmlns:w16sdtdh="http://schemas.microsoft.com/office/word/2020/wordml/sdtdatahash" xmlns:w16se="http://schemas.microsoft.com/office/word/2015/wordml/symex" xmlns:wpg="http://schemas.microsoft.com/office/word/2010/wordprocessingGroup" xmlns:wpi="http://schemas.microsoft.com/office/word/2010/wordprocessingInk" xmlns:wne="http://schemas.microsoft.com/office/word/2006/wordml" xmlns:wps="http://schemas.microsoft.com/office/word/2010/wordprocessingShape" mc:Ignorable="w14 w15 w16se w16cid w16 w16cex w16sdtdh wp14">
   <w:p>
     <w:pPr>
       <w:pStyle w:val="Footer"/>
@@ -2383,7 +2427,7 @@
 </file>
 
 <file path=word/footer2.xml><?xml version="1.0" encoding="utf-8"?>
-<w:ftr xmlns:wpc="http://schemas.microsoft.com/office/word/2010/wordprocessingCanvas" xmlns:cx="http://schemas.microsoft.com/office/drawing/2014/chartex" xmlns:cx1="http://schemas.microsoft.com/office/drawing/2015/9/8/chartex" xmlns:cx2="http://schemas.microsoft.com/office/drawing/2015/10/21/chartex" xmlns:cx3="http://schemas.microsoft.com/office/drawing/2016/5/9/chartex" xmlns:cx4="http://schemas.microsoft.com/office/drawing/2016/5/10/chartex" xmlns:cx5="http://schemas.microsoft.com/office/drawing/2016/5/11/chartex" xmlns:cx6="http://schemas.microsoft.com/office/drawing/2016/5/12/chartex" xmlns:cx7="http://schemas.microsoft.com/office/drawing/2016/5/13/chartex" xmlns:cx8="http://schemas.microsoft.com/office/drawing/2016/5/14/chartex" xmlns:mc="http://schemas.openxmlformats.org/markup-compatibility/2006" xmlns:aink="http://schemas.microsoft.com/office/drawing/2016/ink" xmlns:am3d="http://schemas.microsoft.com/office/drawing/2017/model3d" xmlns:o="urn:schemas-microsoft-com:office:office" xmlns:oel="http://schemas.microsoft.com/office/2019/extlst" xmlns:r="http://schemas.openxmlformats.org/officeDocument/2006/relationships" xmlns:m="http://schemas.openxmlformats.org/officeDocument/2006/math" xmlns:v="urn:schemas-microsoft-com:vml" xmlns:wp14="http://schemas.microsoft.com/office/word/2010/wordprocessingDrawing" xmlns:wp="http://schemas.openxmlformats.org/drawingml/2006/wordprocessingDrawing" xmlns:w10="urn:schemas-microsoft-com:office:word" xmlns:w="http://schemas.openxmlformats.org/wordprocessingml/2006/main" xmlns:w14="http://schemas.microsoft.com/office/word/2010/wordml" xmlns:w15="http://schemas.microsoft.com/office/word/2012/wordml" xmlns:w16cex="http://schemas.microsoft.com/office/word/2018/wordml/cex" xmlns:w16cid="http://schemas.microsoft.com/office/word/2016/wordml/cid" xmlns:w16="http://schemas.microsoft.com/office/word/2018/wordml" xmlns:w16sdtdh="http://schemas.microsoft.com/office/word/2020/wordml/sdtdatahash" xmlns:w16se="http://schemas.microsoft.com/office/word/2015/wordml/symex" xmlns:wpg="http://schemas.microsoft.com/office/word/2010/wordprocessingGroup" xmlns:wpi="http://schemas.microsoft.com/office/word/2010/wordprocessingInk" xmlns:wne="http://schemas.microsoft.com/office/word/2006/wordml" xmlns:wps="http://schemas.microsoft.com/office/word/2010/wordprocessingShape" mc:Ignorable="w14 w15 w16se w16cid w16 w16cex w16sdtdh wp14">
+<w:ftr xmlns:wpc="http://schemas.microsoft.com/office/word/2010/wordprocessingCanvas" xmlns:cx="http://schemas.microsoft.com/office/drawing/2014/chartex" xmlns:cx1="http://schemas.microsoft.com/office/drawing/2015/9/8/chartex" xmlns:cx2="http://schemas.microsoft.com/office/drawing/2015/10/21/chartex" xmlns:cx3="http://schemas.microsoft.com/office/drawing/2016/5/9/chartex" xmlns:cx4="http://schemas.microsoft.com/office/drawing/2016/5/10/chartex" xmlns:cx5="http://schemas.microsoft.com/office/drawing/2016/5/11/chartex" xmlns:cx6="http://schemas.microsoft.com/office/drawing/2016/5/12/chartex" xmlns:cx7="http://schemas.microsoft.com/office/drawing/2016/5/13/chartex" xmlns:cx8="http://schemas.microsoft.com/office/drawing/2016/5/14/chartex" xmlns:mc="http://schemas.openxmlformats.org/markup-compatibility/2006" xmlns:aink="http://schemas.microsoft.com/office/drawing/2016/ink" xmlns:am3d="http://schemas.microsoft.com/office/drawing/2017/model3d" xmlns:o="urn:schemas-microsoft-com:office:office" xmlns:r="http://schemas.openxmlformats.org/officeDocument/2006/relationships" xmlns:m="http://schemas.openxmlformats.org/officeDocument/2006/math" xmlns:v="urn:schemas-microsoft-com:vml" xmlns:wp14="http://schemas.microsoft.com/office/word/2010/wordprocessingDrawing" xmlns:wp="http://schemas.openxmlformats.org/drawingml/2006/wordprocessingDrawing" xmlns:w10="urn:schemas-microsoft-com:office:word" xmlns:w="http://schemas.openxmlformats.org/wordprocessingml/2006/main" xmlns:w14="http://schemas.microsoft.com/office/word/2010/wordml" xmlns:w15="http://schemas.microsoft.com/office/word/2012/wordml" xmlns:w16cex="http://schemas.microsoft.com/office/word/2018/wordml/cex" xmlns:w16cid="http://schemas.microsoft.com/office/word/2016/wordml/cid" xmlns:w16="http://schemas.microsoft.com/office/word/2018/wordml" xmlns:w16sdtdh="http://schemas.microsoft.com/office/word/2020/wordml/sdtdatahash" xmlns:w16se="http://schemas.microsoft.com/office/word/2015/wordml/symex" xmlns:wpg="http://schemas.microsoft.com/office/word/2010/wordprocessingGroup" xmlns:wpi="http://schemas.microsoft.com/office/word/2010/wordprocessingInk" xmlns:wne="http://schemas.microsoft.com/office/word/2006/wordml" xmlns:wps="http://schemas.microsoft.com/office/word/2010/wordprocessingShape" mc:Ignorable="w14 w15 w16se w16cid w16 w16cex w16sdtdh wp14">
   <w:p>
     <w:pPr>
       <w:pStyle w:val="Footer"/>
@@ -2393,7 +2437,7 @@
 </file>
 
 <file path=word/footer3.xml><?xml version="1.0" encoding="utf-8"?>
-<w:ftr xmlns:wpc="http://schemas.microsoft.com/office/word/2010/wordprocessingCanvas" xmlns:cx="http://schemas.microsoft.com/office/drawing/2014/chartex" xmlns:cx1="http://schemas.microsoft.com/office/drawing/2015/9/8/chartex" xmlns:cx2="http://schemas.microsoft.com/office/drawing/2015/10/21/chartex" xmlns:cx3="http://schemas.microsoft.com/office/drawing/2016/5/9/chartex" xmlns:cx4="http://schemas.microsoft.com/office/drawing/2016/5/10/chartex" xmlns:cx5="http://schemas.microsoft.com/office/drawing/2016/5/11/chartex" xmlns:cx6="http://schemas.microsoft.com/office/drawing/2016/5/12/chartex" xmlns:cx7="http://schemas.microsoft.com/office/drawing/2016/5/13/chartex" xmlns:cx8="http://schemas.microsoft.com/office/drawing/2016/5/14/chartex" xmlns:mc="http://schemas.openxmlformats.org/markup-compatibility/2006" xmlns:aink="http://schemas.microsoft.com/office/drawing/2016/ink" xmlns:am3d="http://schemas.microsoft.com/office/drawing/2017/model3d" xmlns:o="urn:schemas-microsoft-com:office:office" xmlns:oel="http://schemas.microsoft.com/office/2019/extlst" xmlns:r="http://schemas.openxmlformats.org/officeDocument/2006/relationships" xmlns:m="http://schemas.openxmlformats.org/officeDocument/2006/math" xmlns:v="urn:schemas-microsoft-com:vml" xmlns:wp14="http://schemas.microsoft.com/office/word/2010/wordprocessingDrawing" xmlns:wp="http://schemas.openxmlformats.org/drawingml/2006/wordprocessingDrawing" xmlns:w10="urn:schemas-microsoft-com:office:word" xmlns:w="http://schemas.openxmlformats.org/wordprocessingml/2006/main" xmlns:w14="http://schemas.microsoft.com/office/word/2010/wordml" xmlns:w15="http://schemas.microsoft.com/office/word/2012/wordml" xmlns:w16cex="http://schemas.microsoft.com/office/word/2018/wordml/cex" xmlns:w16cid="http://schemas.microsoft.com/office/word/2016/wordml/cid" xmlns:w16="http://schemas.microsoft.com/office/word/2018/wordml" xmlns:w16sdtdh="http://schemas.microsoft.com/office/word/2020/wordml/sdtdatahash" xmlns:w16se="http://schemas.microsoft.com/office/word/2015/wordml/symex" xmlns:wpg="http://schemas.microsoft.com/office/word/2010/wordprocessingGroup" xmlns:wpi="http://schemas.microsoft.com/office/word/2010/wordprocessingInk" xmlns:wne="http://schemas.microsoft.com/office/word/2006/wordml" xmlns:wps="http://schemas.microsoft.com/office/word/2010/wordprocessingShape" mc:Ignorable="w14 w15 w16se w16cid w16 w16cex w16sdtdh wp14">
+<w:ftr xmlns:wpc="http://schemas.microsoft.com/office/word/2010/wordprocessingCanvas" xmlns:cx="http://schemas.microsoft.com/office/drawing/2014/chartex" xmlns:cx1="http://schemas.microsoft.com/office/drawing/2015/9/8/chartex" xmlns:cx2="http://schemas.microsoft.com/office/drawing/2015/10/21/chartex" xmlns:cx3="http://schemas.microsoft.com/office/drawing/2016/5/9/chartex" xmlns:cx4="http://schemas.microsoft.com/office/drawing/2016/5/10/chartex" xmlns:cx5="http://schemas.microsoft.com/office/drawing/2016/5/11/chartex" xmlns:cx6="http://schemas.microsoft.com/office/drawing/2016/5/12/chartex" xmlns:cx7="http://schemas.microsoft.com/office/drawing/2016/5/13/chartex" xmlns:cx8="http://schemas.microsoft.com/office/drawing/2016/5/14/chartex" xmlns:mc="http://schemas.openxmlformats.org/markup-compatibility/2006" xmlns:aink="http://schemas.microsoft.com/office/drawing/2016/ink" xmlns:am3d="http://schemas.microsoft.com/office/drawing/2017/model3d" xmlns:o="urn:schemas-microsoft-com:office:office" xmlns:r="http://schemas.openxmlformats.org/officeDocument/2006/relationships" xmlns:m="http://schemas.openxmlformats.org/officeDocument/2006/math" xmlns:v="urn:schemas-microsoft-com:vml" xmlns:wp14="http://schemas.microsoft.com/office/word/2010/wordprocessingDrawing" xmlns:wp="http://schemas.openxmlformats.org/drawingml/2006/wordprocessingDrawing" xmlns:w10="urn:schemas-microsoft-com:office:word" xmlns:w="http://schemas.openxmlformats.org/wordprocessingml/2006/main" xmlns:w14="http://schemas.microsoft.com/office/word/2010/wordml" xmlns:w15="http://schemas.microsoft.com/office/word/2012/wordml" xmlns:w16cex="http://schemas.microsoft.com/office/word/2018/wordml/cex" xmlns:w16cid="http://schemas.microsoft.com/office/word/2016/wordml/cid" xmlns:w16="http://schemas.microsoft.com/office/word/2018/wordml" xmlns:w16sdtdh="http://schemas.microsoft.com/office/word/2020/wordml/sdtdatahash" xmlns:w16se="http://schemas.microsoft.com/office/word/2015/wordml/symex" xmlns:wpg="http://schemas.microsoft.com/office/word/2010/wordprocessingGroup" xmlns:wpi="http://schemas.microsoft.com/office/word/2010/wordprocessingInk" xmlns:wne="http://schemas.microsoft.com/office/word/2006/wordml" xmlns:wps="http://schemas.microsoft.com/office/word/2010/wordprocessingShape" mc:Ignorable="w14 w15 w16se w16cid w16 w16cex w16sdtdh wp14">
   <w:p>
     <w:pPr>
       <w:pStyle w:val="Footer"/>
@@ -2403,7 +2447,7 @@
 </file>
 
 <file path=word/footnotes.xml><?xml version="1.0" encoding="utf-8"?>
-<w:footnotes xmlns:wpc="http://schemas.microsoft.com/office/word/2010/wordprocessingCanvas" xmlns:cx="http://schemas.microsoft.com/office/drawing/2014/chartex" xmlns:cx1="http://schemas.microsoft.com/office/drawing/2015/9/8/chartex" xmlns:cx2="http://schemas.microsoft.com/office/drawing/2015/10/21/chartex" xmlns:cx3="http://schemas.microsoft.com/office/drawing/2016/5/9/chartex" xmlns:cx4="http://schemas.microsoft.com/office/drawing/2016/5/10/chartex" xmlns:cx5="http://schemas.microsoft.com/office/drawing/2016/5/11/chartex" xmlns:cx6="http://schemas.microsoft.com/office/drawing/2016/5/12/chartex" xmlns:cx7="http://schemas.microsoft.com/office/drawing/2016/5/13/chartex" xmlns:cx8="http://schemas.microsoft.com/office/drawing/2016/5/14/chartex" xmlns:mc="http://schemas.openxmlformats.org/markup-compatibility/2006" xmlns:aink="http://schemas.microsoft.com/office/drawing/2016/ink" xmlns:am3d="http://schemas.microsoft.com/office/drawing/2017/model3d" xmlns:o="urn:schemas-microsoft-com:office:office" xmlns:oel="http://schemas.microsoft.com/office/2019/extlst" xmlns:r="http://schemas.openxmlformats.org/officeDocument/2006/relationships" xmlns:m="http://schemas.openxmlformats.org/officeDocument/2006/math" xmlns:v="urn:schemas-microsoft-com:vml" xmlns:wp14="http://schemas.microsoft.com/office/word/2010/wordprocessingDrawing" xmlns:wp="http://schemas.openxmlformats.org/drawingml/2006/wordprocessingDrawing" xmlns:w10="urn:schemas-microsoft-com:office:word" xmlns:w="http://schemas.openxmlformats.org/wordprocessingml/2006/main" xmlns:w14="http://schemas.microsoft.com/office/word/2010/wordml" xmlns:w15="http://schemas.microsoft.com/office/word/2012/wordml" xmlns:w16cex="http://schemas.microsoft.com/office/word/2018/wordml/cex" xmlns:w16cid="http://schemas.microsoft.com/office/word/2016/wordml/cid" xmlns:w16="http://schemas.microsoft.com/office/word/2018/wordml" xmlns:w16sdtdh="http://schemas.microsoft.com/office/word/2020/wordml/sdtdatahash" xmlns:w16se="http://schemas.microsoft.com/office/word/2015/wordml/symex" xmlns:wpg="http://schemas.microsoft.com/office/word/2010/wordprocessingGroup" xmlns:wpi="http://schemas.microsoft.com/office/word/2010/wordprocessingInk" xmlns:wne="http://schemas.microsoft.com/office/word/2006/wordml" xmlns:wps="http://schemas.microsoft.com/office/word/2010/wordprocessingShape" mc:Ignorable="w14 w15 w16se w16cid w16 w16cex w16sdtdh wp14">
+<w:footnotes xmlns:wpc="http://schemas.microsoft.com/office/word/2010/wordprocessingCanvas" xmlns:cx="http://schemas.microsoft.com/office/drawing/2014/chartex" xmlns:cx1="http://schemas.microsoft.com/office/drawing/2015/9/8/chartex" xmlns:cx2="http://schemas.microsoft.com/office/drawing/2015/10/21/chartex" xmlns:cx3="http://schemas.microsoft.com/office/drawing/2016/5/9/chartex" xmlns:cx4="http://schemas.microsoft.com/office/drawing/2016/5/10/chartex" xmlns:cx5="http://schemas.microsoft.com/office/drawing/2016/5/11/chartex" xmlns:cx6="http://schemas.microsoft.com/office/drawing/2016/5/12/chartex" xmlns:cx7="http://schemas.microsoft.com/office/drawing/2016/5/13/chartex" xmlns:cx8="http://schemas.microsoft.com/office/drawing/2016/5/14/chartex" xmlns:mc="http://schemas.openxmlformats.org/markup-compatibility/2006" xmlns:aink="http://schemas.microsoft.com/office/drawing/2016/ink" xmlns:am3d="http://schemas.microsoft.com/office/drawing/2017/model3d" xmlns:o="urn:schemas-microsoft-com:office:office" xmlns:r="http://schemas.openxmlformats.org/officeDocument/2006/relationships" xmlns:m="http://schemas.openxmlformats.org/officeDocument/2006/math" xmlns:v="urn:schemas-microsoft-com:vml" xmlns:wp14="http://schemas.microsoft.com/office/word/2010/wordprocessingDrawing" xmlns:wp="http://schemas.openxmlformats.org/drawingml/2006/wordprocessingDrawing" xmlns:w10="urn:schemas-microsoft-com:office:word" xmlns:w="http://schemas.openxmlformats.org/wordprocessingml/2006/main" xmlns:w14="http://schemas.microsoft.com/office/word/2010/wordml" xmlns:w15="http://schemas.microsoft.com/office/word/2012/wordml" xmlns:w16cex="http://schemas.microsoft.com/office/word/2018/wordml/cex" xmlns:w16cid="http://schemas.microsoft.com/office/word/2016/wordml/cid" xmlns:w16="http://schemas.microsoft.com/office/word/2018/wordml" xmlns:w16sdtdh="http://schemas.microsoft.com/office/word/2020/wordml/sdtdatahash" xmlns:w16se="http://schemas.microsoft.com/office/word/2015/wordml/symex" xmlns:wpg="http://schemas.microsoft.com/office/word/2010/wordprocessingGroup" xmlns:wpi="http://schemas.microsoft.com/office/word/2010/wordprocessingInk" xmlns:wne="http://schemas.microsoft.com/office/word/2006/wordml" xmlns:wps="http://schemas.microsoft.com/office/word/2010/wordprocessingShape" mc:Ignorable="w14 w15 w16se w16cid w16 w16cex w16sdtdh wp14">
   <w:footnote w:type="separator" w:id="-1">
     <w:p>
       <w:r>
@@ -2429,7 +2473,7 @@
 </file>
 
 <file path=word/header1.xml><?xml version="1.0" encoding="utf-8"?>
-<w:hdr xmlns:wpc="http://schemas.microsoft.com/office/word/2010/wordprocessingCanvas" xmlns:cx="http://schemas.microsoft.com/office/drawing/2014/chartex" xmlns:cx1="http://schemas.microsoft.com/office/drawing/2015/9/8/chartex" xmlns:cx2="http://schemas.microsoft.com/office/drawing/2015/10/21/chartex" xmlns:cx3="http://schemas.microsoft.com/office/drawing/2016/5/9/chartex" xmlns:cx4="http://schemas.microsoft.com/office/drawing/2016/5/10/chartex" xmlns:cx5="http://schemas.microsoft.com/office/drawing/2016/5/11/chartex" xmlns:cx6="http://schemas.microsoft.com/office/drawing/2016/5/12/chartex" xmlns:cx7="http://schemas.microsoft.com/office/drawing/2016/5/13/chartex" xmlns:cx8="http://schemas.microsoft.com/office/drawing/2016/5/14/chartex" xmlns:mc="http://schemas.openxmlformats.org/markup-compatibility/2006" xmlns:aink="http://schemas.microsoft.com/office/drawing/2016/ink" xmlns:am3d="http://schemas.microsoft.com/office/drawing/2017/model3d" xmlns:o="urn:schemas-microsoft-com:office:office" xmlns:oel="http://schemas.microsoft.com/office/2019/extlst" xmlns:r="http://schemas.openxmlformats.org/officeDocument/2006/relationships" xmlns:m="http://schemas.openxmlformats.org/officeDocument/2006/math" xmlns:v="urn:schemas-microsoft-com:vml" xmlns:wp14="http://schemas.microsoft.com/office/word/2010/wordprocessingDrawing" xmlns:wp="http://schemas.openxmlformats.org/drawingml/2006/wordprocessingDrawing" xmlns:w10="urn:schemas-microsoft-com:office:word" xmlns:w="http://schemas.openxmlformats.org/wordprocessingml/2006/main" xmlns:w14="http://schemas.microsoft.com/office/word/2010/wordml" xmlns:w15="http://schemas.microsoft.com/office/word/2012/wordml" xmlns:w16cex="http://schemas.microsoft.com/office/word/2018/wordml/cex" xmlns:w16cid="http://schemas.microsoft.com/office/word/2016/wordml/cid" xmlns:w16="http://schemas.microsoft.com/office/word/2018/wordml" xmlns:w16sdtdh="http://schemas.microsoft.com/office/word/2020/wordml/sdtdatahash" xmlns:w16se="http://schemas.microsoft.com/office/word/2015/wordml/symex" xmlns:wpg="http://schemas.microsoft.com/office/word/2010/wordprocessingGroup" xmlns:wpi="http://schemas.microsoft.com/office/word/2010/wordprocessingInk" xmlns:wne="http://schemas.microsoft.com/office/word/2006/wordml" xmlns:wps="http://schemas.microsoft.com/office/word/2010/wordprocessingShape" mc:Ignorable="w14 w15 w16se w16cid w16 w16cex w16sdtdh wp14">
+<w:hdr xmlns:wpc="http://schemas.microsoft.com/office/word/2010/wordprocessingCanvas" xmlns:cx="http://schemas.microsoft.com/office/drawing/2014/chartex" xmlns:cx1="http://schemas.microsoft.com/office/drawing/2015/9/8/chartex" xmlns:cx2="http://schemas.microsoft.com/office/drawing/2015/10/21/chartex" xmlns:cx3="http://schemas.microsoft.com/office/drawing/2016/5/9/chartex" xmlns:cx4="http://schemas.microsoft.com/office/drawing/2016/5/10/chartex" xmlns:cx5="http://schemas.microsoft.com/office/drawing/2016/5/11/chartex" xmlns:cx6="http://schemas.microsoft.com/office/drawing/2016/5/12/chartex" xmlns:cx7="http://schemas.microsoft.com/office/drawing/2016/5/13/chartex" xmlns:cx8="http://schemas.microsoft.com/office/drawing/2016/5/14/chartex" xmlns:mc="http://schemas.openxmlformats.org/markup-compatibility/2006" xmlns:aink="http://schemas.microsoft.com/office/drawing/2016/ink" xmlns:am3d="http://schemas.microsoft.com/office/drawing/2017/model3d" xmlns:o="urn:schemas-microsoft-com:office:office" xmlns:r="http://schemas.openxmlformats.org/officeDocument/2006/relationships" xmlns:m="http://schemas.openxmlformats.org/officeDocument/2006/math" xmlns:v="urn:schemas-microsoft-com:vml" xmlns:wp14="http://schemas.microsoft.com/office/word/2010/wordprocessingDrawing" xmlns:wp="http://schemas.openxmlformats.org/drawingml/2006/wordprocessingDrawing" xmlns:w10="urn:schemas-microsoft-com:office:word" xmlns:w="http://schemas.openxmlformats.org/wordprocessingml/2006/main" xmlns:w14="http://schemas.microsoft.com/office/word/2010/wordml" xmlns:w15="http://schemas.microsoft.com/office/word/2012/wordml" xmlns:w16cex="http://schemas.microsoft.com/office/word/2018/wordml/cex" xmlns:w16cid="http://schemas.microsoft.com/office/word/2016/wordml/cid" xmlns:w16="http://schemas.microsoft.com/office/word/2018/wordml" xmlns:w16sdtdh="http://schemas.microsoft.com/office/word/2020/wordml/sdtdatahash" xmlns:w16se="http://schemas.microsoft.com/office/word/2015/wordml/symex" xmlns:wpg="http://schemas.microsoft.com/office/word/2010/wordprocessingGroup" xmlns:wpi="http://schemas.microsoft.com/office/word/2010/wordprocessingInk" xmlns:wne="http://schemas.microsoft.com/office/word/2006/wordml" xmlns:wps="http://schemas.microsoft.com/office/word/2010/wordprocessingShape" mc:Ignorable="w14 w15 w16se w16cid w16 w16cex w16sdtdh wp14">
   <w:p>
     <w:pPr>
       <w:pStyle w:val="Header"/>
@@ -2439,7 +2483,7 @@
 </file>
 
 <file path=word/header2.xml><?xml version="1.0" encoding="utf-8"?>
-<w:hdr xmlns:wpc="http://schemas.microsoft.com/office/word/2010/wordprocessingCanvas" xmlns:cx="http://schemas.microsoft.com/office/drawing/2014/chartex" xmlns:cx1="http://schemas.microsoft.com/office/drawing/2015/9/8/chartex" xmlns:cx2="http://schemas.microsoft.com/office/drawing/2015/10/21/chartex" xmlns:cx3="http://schemas.microsoft.com/office/drawing/2016/5/9/chartex" xmlns:cx4="http://schemas.microsoft.com/office/drawing/2016/5/10/chartex" xmlns:cx5="http://schemas.microsoft.com/office/drawing/2016/5/11/chartex" xmlns:cx6="http://schemas.microsoft.com/office/drawing/2016/5/12/chartex" xmlns:cx7="http://schemas.microsoft.com/office/drawing/2016/5/13/chartex" xmlns:cx8="http://schemas.microsoft.com/office/drawing/2016/5/14/chartex" xmlns:mc="http://schemas.openxmlformats.org/markup-compatibility/2006" xmlns:aink="http://schemas.microsoft.com/office/drawing/2016/ink" xmlns:am3d="http://schemas.microsoft.com/office/drawing/2017/model3d" xmlns:o="urn:schemas-microsoft-com:office:office" xmlns:oel="http://schemas.microsoft.com/office/2019/extlst" xmlns:r="http://schemas.openxmlformats.org/officeDocument/2006/relationships" xmlns:m="http://schemas.openxmlformats.org/officeDocument/2006/math" xmlns:v="urn:schemas-microsoft-com:vml" xmlns:wp14="http://schemas.microsoft.com/office/word/2010/wordprocessingDrawing" xmlns:wp="http://schemas.openxmlformats.org/drawingml/2006/wordprocessingDrawing" xmlns:w10="urn:schemas-microsoft-com:office:word" xmlns:w="http://schemas.openxmlformats.org/wordprocessingml/2006/main" xmlns:w14="http://schemas.microsoft.com/office/word/2010/wordml" xmlns:w15="http://schemas.microsoft.com/office/word/2012/wordml" xmlns:w16cex="http://schemas.microsoft.com/office/word/2018/wordml/cex" xmlns:w16cid="http://schemas.microsoft.com/office/word/2016/wordml/cid" xmlns:w16="http://schemas.microsoft.com/office/word/2018/wordml" xmlns:w16sdtdh="http://schemas.microsoft.com/office/word/2020/wordml/sdtdatahash" xmlns:w16se="http://schemas.microsoft.com/office/word/2015/wordml/symex" xmlns:wpg="http://schemas.microsoft.com/office/word/2010/wordprocessingGroup" xmlns:wpi="http://schemas.microsoft.com/office/word/2010/wordprocessingInk" xmlns:wne="http://schemas.microsoft.com/office/word/2006/wordml" xmlns:wps="http://schemas.microsoft.com/office/word/2010/wordprocessingShape" mc:Ignorable="w14 w15 w16se w16cid w16 w16cex w16sdtdh wp14">
+<w:hdr xmlns:wpc="http://schemas.microsoft.com/office/word/2010/wordprocessingCanvas" xmlns:cx="http://schemas.microsoft.com/office/drawing/2014/chartex" xmlns:cx1="http://schemas.microsoft.com/office/drawing/2015/9/8/chartex" xmlns:cx2="http://schemas.microsoft.com/office/drawing/2015/10/21/chartex" xmlns:cx3="http://schemas.microsoft.com/office/drawing/2016/5/9/chartex" xmlns:cx4="http://schemas.microsoft.com/office/drawing/2016/5/10/chartex" xmlns:cx5="http://schemas.microsoft.com/office/drawing/2016/5/11/chartex" xmlns:cx6="http://schemas.microsoft.com/office/drawing/2016/5/12/chartex" xmlns:cx7="http://schemas.microsoft.com/office/drawing/2016/5/13/chartex" xmlns:cx8="http://schemas.microsoft.com/office/drawing/2016/5/14/chartex" xmlns:mc="http://schemas.openxmlformats.org/markup-compatibility/2006" xmlns:aink="http://schemas.microsoft.com/office/drawing/2016/ink" xmlns:am3d="http://schemas.microsoft.com/office/drawing/2017/model3d" xmlns:o="urn:schemas-microsoft-com:office:office" xmlns:r="http://schemas.openxmlformats.org/officeDocument/2006/relationships" xmlns:m="http://schemas.openxmlformats.org/officeDocument/2006/math" xmlns:v="urn:schemas-microsoft-com:vml" xmlns:wp14="http://schemas.microsoft.com/office/word/2010/wordprocessingDrawing" xmlns:wp="http://schemas.openxmlformats.org/drawingml/2006/wordprocessingDrawing" xmlns:w10="urn:schemas-microsoft-com:office:word" xmlns:w="http://schemas.openxmlformats.org/wordprocessingml/2006/main" xmlns:w14="http://schemas.microsoft.com/office/word/2010/wordml" xmlns:w15="http://schemas.microsoft.com/office/word/2012/wordml" xmlns:w16cex="http://schemas.microsoft.com/office/word/2018/wordml/cex" xmlns:w16cid="http://schemas.microsoft.com/office/word/2016/wordml/cid" xmlns:w16="http://schemas.microsoft.com/office/word/2018/wordml" xmlns:w16sdtdh="http://schemas.microsoft.com/office/word/2020/wordml/sdtdatahash" xmlns:w16se="http://schemas.microsoft.com/office/word/2015/wordml/symex" xmlns:wpg="http://schemas.microsoft.com/office/word/2010/wordprocessingGroup" xmlns:wpi="http://schemas.microsoft.com/office/word/2010/wordprocessingInk" xmlns:wne="http://schemas.microsoft.com/office/word/2006/wordml" xmlns:wps="http://schemas.microsoft.com/office/word/2010/wordprocessingShape" mc:Ignorable="w14 w15 w16se w16cid w16 w16cex w16sdtdh wp14">
   <w:p>
     <w:pPr>
       <w:pStyle w:val="Header"/>
@@ -2449,7 +2493,7 @@
 </file>
 
 <file path=word/header3.xml><?xml version="1.0" encoding="utf-8"?>
-<w:hdr xmlns:wpc="http://schemas.microsoft.com/office/word/2010/wordprocessingCanvas" xmlns:cx="http://schemas.microsoft.com/office/drawing/2014/chartex" xmlns:cx1="http://schemas.microsoft.com/office/drawing/2015/9/8/chartex" xmlns:cx2="http://schemas.microsoft.com/office/drawing/2015/10/21/chartex" xmlns:cx3="http://schemas.microsoft.com/office/drawing/2016/5/9/chartex" xmlns:cx4="http://schemas.microsoft.com/office/drawing/2016/5/10/chartex" xmlns:cx5="http://schemas.microsoft.com/office/drawing/2016/5/11/chartex" xmlns:cx6="http://schemas.microsoft.com/office/drawing/2016/5/12/chartex" xmlns:cx7="http://schemas.microsoft.com/office/drawing/2016/5/13/chartex" xmlns:cx8="http://schemas.microsoft.com/office/drawing/2016/5/14/chartex" xmlns:mc="http://schemas.openxmlformats.org/markup-compatibility/2006" xmlns:aink="http://schemas.microsoft.com/office/drawing/2016/ink" xmlns:am3d="http://schemas.microsoft.com/office/drawing/2017/model3d" xmlns:o="urn:schemas-microsoft-com:office:office" xmlns:oel="http://schemas.microsoft.com/office/2019/extlst" xmlns:r="http://schemas.openxmlformats.org/officeDocument/2006/relationships" xmlns:m="http://schemas.openxmlformats.org/officeDocument/2006/math" xmlns:v="urn:schemas-microsoft-com:vml" xmlns:wp14="http://schemas.microsoft.com/office/word/2010/wordprocessingDrawing" xmlns:wp="http://schemas.openxmlformats.org/drawingml/2006/wordprocessingDrawing" xmlns:w10="urn:schemas-microsoft-com:office:word" xmlns:w="http://schemas.openxmlformats.org/wordprocessingml/2006/main" xmlns:w14="http://schemas.microsoft.com/office/word/2010/wordml" xmlns:w15="http://schemas.microsoft.com/office/word/2012/wordml" xmlns:w16cex="http://schemas.microsoft.com/office/word/2018/wordml/cex" xmlns:w16cid="http://schemas.microsoft.com/office/word/2016/wordml/cid" xmlns:w16="http://schemas.microsoft.com/office/word/2018/wordml" xmlns:w16sdtdh="http://schemas.microsoft.com/office/word/2020/wordml/sdtdatahash" xmlns:w16se="http://schemas.microsoft.com/office/word/2015/wordml/symex" xmlns:wpg="http://schemas.microsoft.com/office/word/2010/wordprocessingGroup" xmlns:wpi="http://schemas.microsoft.com/office/word/2010/wordprocessingInk" xmlns:wne="http://schemas.microsoft.com/office/word/2006/wordml" xmlns:wps="http://schemas.microsoft.com/office/word/2010/wordprocessingShape" mc:Ignorable="w14 w15 w16se w16cid w16 w16cex w16sdtdh wp14">
+<w:hdr xmlns:wpc="http://schemas.microsoft.com/office/word/2010/wordprocessingCanvas" xmlns:cx="http://schemas.microsoft.com/office/drawing/2014/chartex" xmlns:cx1="http://schemas.microsoft.com/office/drawing/2015/9/8/chartex" xmlns:cx2="http://schemas.microsoft.com/office/drawing/2015/10/21/chartex" xmlns:cx3="http://schemas.microsoft.com/office/drawing/2016/5/9/chartex" xmlns:cx4="http://schemas.microsoft.com/office/drawing/2016/5/10/chartex" xmlns:cx5="http://schemas.microsoft.com/office/drawing/2016/5/11/chartex" xmlns:cx6="http://schemas.microsoft.com/office/drawing/2016/5/12/chartex" xmlns:cx7="http://schemas.microsoft.com/office/drawing/2016/5/13/chartex" xmlns:cx8="http://schemas.microsoft.com/office/drawing/2016/5/14/chartex" xmlns:mc="http://schemas.openxmlformats.org/markup-compatibility/2006" xmlns:aink="http://schemas.microsoft.com/office/drawing/2016/ink" xmlns:am3d="http://schemas.microsoft.com/office/drawing/2017/model3d" xmlns:o="urn:schemas-microsoft-com:office:office" xmlns:r="http://schemas.openxmlformats.org/officeDocument/2006/relationships" xmlns:m="http://schemas.openxmlformats.org/officeDocument/2006/math" xmlns:v="urn:schemas-microsoft-com:vml" xmlns:wp14="http://schemas.microsoft.com/office/word/2010/wordprocessingDrawing" xmlns:wp="http://schemas.openxmlformats.org/drawingml/2006/wordprocessingDrawing" xmlns:w10="urn:schemas-microsoft-com:office:word" xmlns:w="http://schemas.openxmlformats.org/wordprocessingml/2006/main" xmlns:w14="http://schemas.microsoft.com/office/word/2010/wordml" xmlns:w15="http://schemas.microsoft.com/office/word/2012/wordml" xmlns:w16cex="http://schemas.microsoft.com/office/word/2018/wordml/cex" xmlns:w16cid="http://schemas.microsoft.com/office/word/2016/wordml/cid" xmlns:w16="http://schemas.microsoft.com/office/word/2018/wordml" xmlns:w16sdtdh="http://schemas.microsoft.com/office/word/2020/wordml/sdtdatahash" xmlns:w16se="http://schemas.microsoft.com/office/word/2015/wordml/symex" xmlns:wpg="http://schemas.microsoft.com/office/word/2010/wordprocessingGroup" xmlns:wpi="http://schemas.microsoft.com/office/word/2010/wordprocessingInk" xmlns:wne="http://schemas.microsoft.com/office/word/2006/wordml" xmlns:wps="http://schemas.microsoft.com/office/word/2010/wordprocessingShape" mc:Ignorable="w14 w15 w16se w16cid w16 w16cex w16sdtdh wp14">
   <w:p>
     <w:pPr>
       <w:pStyle w:val="Header"/>
@@ -2459,7 +2503,7 @@
 </file>
 
 <file path=word/numbering.xml><?xml version="1.0" encoding="utf-8"?>
-<w:numbering xmlns:wpc="http://schemas.microsoft.com/office/word/2010/wordprocessingCanvas" xmlns:cx="http://schemas.microsoft.com/office/drawing/2014/chartex" xmlns:cx1="http://schemas.microsoft.com/office/drawing/2015/9/8/chartex" xmlns:cx2="http://schemas.microsoft.com/office/drawing/2015/10/21/chartex" xmlns:cx3="http://schemas.microsoft.com/office/drawing/2016/5/9/chartex" xmlns:cx4="http://schemas.microsoft.com/office/drawing/2016/5/10/chartex" xmlns:cx5="http://schemas.microsoft.com/office/drawing/2016/5/11/chartex" xmlns:cx6="http://schemas.microsoft.com/office/drawing/2016/5/12/chartex" xmlns:cx7="http://schemas.microsoft.com/office/drawing/2016/5/13/chartex" xmlns:cx8="http://schemas.microsoft.com/office/drawing/2016/5/14/chartex" xmlns:mc="http://schemas.openxmlformats.org/markup-compatibility/2006" xmlns:aink="http://schemas.microsoft.com/office/drawing/2016/ink" xmlns:am3d="http://schemas.microsoft.com/office/drawing/2017/model3d" xmlns:o="urn:schemas-microsoft-com:office:office" xmlns:oel="http://schemas.microsoft.com/office/2019/extlst" xmlns:r="http://schemas.openxmlformats.org/officeDocument/2006/relationships" xmlns:m="http://schemas.openxmlformats.org/officeDocument/2006/math" xmlns:v="urn:schemas-microsoft-com:vml" xmlns:wp14="http://schemas.microsoft.com/office/word/2010/wordprocessingDrawing" xmlns:wp="http://schemas.openxmlformats.org/drawingml/2006/wordprocessingDrawing" xmlns:w10="urn:schemas-microsoft-com:office:word" xmlns:w="http://schemas.openxmlformats.org/wordprocessingml/2006/main" xmlns:w14="http://schemas.microsoft.com/office/word/2010/wordml" xmlns:w15="http://schemas.microsoft.com/office/word/2012/wordml" xmlns:w16cex="http://schemas.microsoft.com/office/word/2018/wordml/cex" xmlns:w16cid="http://schemas.microsoft.com/office/word/2016/wordml/cid" xmlns:w16="http://schemas.microsoft.com/office/word/2018/wordml" xmlns:w16sdtdh="http://schemas.microsoft.com/office/word/2020/wordml/sdtdatahash" xmlns:w16se="http://schemas.microsoft.com/office/word/2015/wordml/symex" xmlns:wpg="http://schemas.microsoft.com/office/word/2010/wordprocessingGroup" xmlns:wpi="http://schemas.microsoft.com/office/word/2010/wordprocessingInk" xmlns:wne="http://schemas.microsoft.com/office/word/2006/wordml" xmlns:wps="http://schemas.microsoft.com/office/word/2010/wordprocessingShape" mc:Ignorable="w14 w15 w16se w16cid w16 w16cex w16sdtdh wp14">
+<w:numbering xmlns:wpc="http://schemas.microsoft.com/office/word/2010/wordprocessingCanvas" xmlns:cx="http://schemas.microsoft.com/office/drawing/2014/chartex" xmlns:cx1="http://schemas.microsoft.com/office/drawing/2015/9/8/chartex" xmlns:cx2="http://schemas.microsoft.com/office/drawing/2015/10/21/chartex" xmlns:cx3="http://schemas.microsoft.com/office/drawing/2016/5/9/chartex" xmlns:cx4="http://schemas.microsoft.com/office/drawing/2016/5/10/chartex" xmlns:cx5="http://schemas.microsoft.com/office/drawing/2016/5/11/chartex" xmlns:cx6="http://schemas.microsoft.com/office/drawing/2016/5/12/chartex" xmlns:cx7="http://schemas.microsoft.com/office/drawing/2016/5/13/chartex" xmlns:cx8="http://schemas.microsoft.com/office/drawing/2016/5/14/chartex" xmlns:mc="http://schemas.openxmlformats.org/markup-compatibility/2006" xmlns:aink="http://schemas.microsoft.com/office/drawing/2016/ink" xmlns:am3d="http://schemas.microsoft.com/office/drawing/2017/model3d" xmlns:o="urn:schemas-microsoft-com:office:office" xmlns:r="http://schemas.openxmlformats.org/officeDocument/2006/relationships" xmlns:m="http://schemas.openxmlformats.org/officeDocument/2006/math" xmlns:v="urn:schemas-microsoft-com:vml" xmlns:wp14="http://schemas.microsoft.com/office/word/2010/wordprocessingDrawing" xmlns:wp="http://schemas.openxmlformats.org/drawingml/2006/wordprocessingDrawing" xmlns:w10="urn:schemas-microsoft-com:office:word" xmlns:w="http://schemas.openxmlformats.org/wordprocessingml/2006/main" xmlns:w14="http://schemas.microsoft.com/office/word/2010/wordml" xmlns:w15="http://schemas.microsoft.com/office/word/2012/wordml" xmlns:w16cex="http://schemas.microsoft.com/office/word/2018/wordml/cex" xmlns:w16cid="http://schemas.microsoft.com/office/word/2016/wordml/cid" xmlns:w16="http://schemas.microsoft.com/office/word/2018/wordml" xmlns:w16sdtdh="http://schemas.microsoft.com/office/word/2020/wordml/sdtdatahash" xmlns:w16se="http://schemas.microsoft.com/office/word/2015/wordml/symex" xmlns:wpg="http://schemas.microsoft.com/office/word/2010/wordprocessingGroup" xmlns:wpi="http://schemas.microsoft.com/office/word/2010/wordprocessingInk" xmlns:wne="http://schemas.microsoft.com/office/word/2006/wordml" xmlns:wps="http://schemas.microsoft.com/office/word/2010/wordprocessingShape" mc:Ignorable="w14 w15 w16se w16cid w16 w16cex w16sdtdh wp14">
   <w:abstractNum w:abstractNumId="0" w15:restartNumberingAfterBreak="0">
     <w:nsid w:val="09C1550F"/>
     <w:multiLevelType w:val="hybridMultilevel"/>
@@ -3794,40 +3838,48 @@
       </w:rPr>
     </w:lvl>
   </w:abstractNum>
-  <w:num w:numId="1" w16cid:durableId="693271098">
+  <w:num w:numId="1">
     <w:abstractNumId w:val="5"/>
   </w:num>
-  <w:num w:numId="2" w16cid:durableId="2016225085">
+  <w:num w:numId="2">
     <w:abstractNumId w:val="0"/>
   </w:num>
-  <w:num w:numId="3" w16cid:durableId="1819227573">
+  <w:num w:numId="3">
     <w:abstractNumId w:val="1"/>
   </w:num>
-  <w:num w:numId="4" w16cid:durableId="1163736952">
+  <w:num w:numId="4">
     <w:abstractNumId w:val="8"/>
   </w:num>
-  <w:num w:numId="5" w16cid:durableId="661547867">
+  <w:num w:numId="5">
     <w:abstractNumId w:val="7"/>
   </w:num>
-  <w:num w:numId="6" w16cid:durableId="1226575128">
+  <w:num w:numId="6">
     <w:abstractNumId w:val="2"/>
   </w:num>
-  <w:num w:numId="7" w16cid:durableId="1720663912">
+  <w:num w:numId="7">
     <w:abstractNumId w:val="10"/>
   </w:num>
-  <w:num w:numId="8" w16cid:durableId="958688137">
+  <w:num w:numId="8">
     <w:abstractNumId w:val="3"/>
   </w:num>
-  <w:num w:numId="9" w16cid:durableId="1823425222">
+  <w:num w:numId="9">
     <w:abstractNumId w:val="4"/>
   </w:num>
-  <w:num w:numId="10" w16cid:durableId="1742170314">
+  <w:num w:numId="10">
     <w:abstractNumId w:val="9"/>
   </w:num>
-  <w:num w:numId="11" w16cid:durableId="65231546">
+  <w:num w:numId="11">
     <w:abstractNumId w:val="6"/>
   </w:num>
 </w:numbering>
+</file>
+
+<file path=word/people.xml><?xml version="1.0" encoding="utf-8"?>
+<w15:people xmlns:wpc="http://schemas.microsoft.com/office/word/2010/wordprocessingCanvas" xmlns:cx="http://schemas.microsoft.com/office/drawing/2014/chartex" xmlns:cx1="http://schemas.microsoft.com/office/drawing/2015/9/8/chartex" xmlns:cx2="http://schemas.microsoft.com/office/drawing/2015/10/21/chartex" xmlns:cx3="http://schemas.microsoft.com/office/drawing/2016/5/9/chartex" xmlns:cx4="http://schemas.microsoft.com/office/drawing/2016/5/10/chartex" xmlns:cx5="http://schemas.microsoft.com/office/drawing/2016/5/11/chartex" xmlns:cx6="http://schemas.microsoft.com/office/drawing/2016/5/12/chartex" xmlns:cx7="http://schemas.microsoft.com/office/drawing/2016/5/13/chartex" xmlns:cx8="http://schemas.microsoft.com/office/drawing/2016/5/14/chartex" xmlns:mc="http://schemas.openxmlformats.org/markup-compatibility/2006" xmlns:aink="http://schemas.microsoft.com/office/drawing/2016/ink" xmlns:am3d="http://schemas.microsoft.com/office/drawing/2017/model3d" xmlns:o="urn:schemas-microsoft-com:office:office" xmlns:r="http://schemas.openxmlformats.org/officeDocument/2006/relationships" xmlns:m="http://schemas.openxmlformats.org/officeDocument/2006/math" xmlns:v="urn:schemas-microsoft-com:vml" xmlns:wp14="http://schemas.microsoft.com/office/word/2010/wordprocessingDrawing" xmlns:wp="http://schemas.openxmlformats.org/drawingml/2006/wordprocessingDrawing" xmlns:w10="urn:schemas-microsoft-com:office:word" xmlns:w="http://schemas.openxmlformats.org/wordprocessingml/2006/main" xmlns:w14="http://schemas.microsoft.com/office/word/2010/wordml" xmlns:w15="http://schemas.microsoft.com/office/word/2012/wordml" xmlns:w16cex="http://schemas.microsoft.com/office/word/2018/wordml/cex" xmlns:w16cid="http://schemas.microsoft.com/office/word/2016/wordml/cid" xmlns:w16="http://schemas.microsoft.com/office/word/2018/wordml" xmlns:w16sdtdh="http://schemas.microsoft.com/office/word/2020/wordml/sdtdatahash" xmlns:w16se="http://schemas.microsoft.com/office/word/2015/wordml/symex" xmlns:wpg="http://schemas.microsoft.com/office/word/2010/wordprocessingGroup" xmlns:wpi="http://schemas.microsoft.com/office/word/2010/wordprocessingInk" xmlns:wne="http://schemas.microsoft.com/office/word/2006/wordml" xmlns:wps="http://schemas.microsoft.com/office/word/2010/wordprocessingShape" mc:Ignorable="w14 w15 w16se w16cid w16 w16cex w16sdtdh wp14">
+  <w15:person w15:author="Mattea Goalen">
+    <w15:presenceInfo w15:providerId="AD" w15:userId="S::mattea.goalen@npl.co.uk::d8faf187-a63c-4ca8-891c-e938b8f5c198"/>
+  </w15:person>
+</w15:people>
 </file>
 
 <file path=word/styles.xml><?xml version="1.0" encoding="utf-8"?>
@@ -5151,12 +5203,9 @@
 </file>
 
 <file path=customXml/item1.xml><?xml version="1.0" encoding="utf-8"?>
-<?mso-contentType ?>
-<FormTemplates xmlns="http://schemas.microsoft.com/sharepoint/v3/contenttype/forms">
-  <Display>DocumentLibraryForm</Display>
-  <Edit>DocumentLibraryForm</Edit>
-  <New>DocumentLibraryForm</New>
-</FormTemplates>
+<p:properties xmlns:p="http://schemas.microsoft.com/office/2006/metadata/properties" xmlns:xsi="http://www.w3.org/2001/XMLSchema-instance" xmlns:pc="http://schemas.microsoft.com/office/infopath/2007/PartnerControls">
+  <documentManagement/>
+</p:properties>
 </file>
 
 <file path=customXml/item2.xml><?xml version="1.0" encoding="utf-8"?>
@@ -5383,15 +5432,19 @@
 </file>
 
 <file path=customXml/item3.xml><?xml version="1.0" encoding="utf-8"?>
-<p:properties xmlns:p="http://schemas.microsoft.com/office/2006/metadata/properties" xmlns:xsi="http://www.w3.org/2001/XMLSchema-instance" xmlns:pc="http://schemas.microsoft.com/office/infopath/2007/PartnerControls">
-  <documentManagement/>
-</p:properties>
+<?mso-contentType ?>
+<FormTemplates xmlns="http://schemas.microsoft.com/sharepoint/v3/contenttype/forms">
+  <Display>DocumentLibraryForm</Display>
+  <Edit>DocumentLibraryForm</Edit>
+  <New>DocumentLibraryForm</New>
+</FormTemplates>
 </file>
 
 <file path=customXml/itemProps1.xml><?xml version="1.0" encoding="utf-8"?>
-<ds:datastoreItem xmlns:ds="http://schemas.openxmlformats.org/officeDocument/2006/customXml" ds:itemID="{486DDB34-CE7B-435F-9FCA-D45A5AD28337}">
+<ds:datastoreItem xmlns:ds="http://schemas.openxmlformats.org/officeDocument/2006/customXml" ds:itemID="{26BE6D6A-B531-4609-BB00-F52D88A684F2}">
   <ds:schemaRefs>
-    <ds:schemaRef ds:uri="http://schemas.microsoft.com/sharepoint/v3/contenttype/forms"/>
+    <ds:schemaRef ds:uri="http://schemas.microsoft.com/office/2006/metadata/properties"/>
+    <ds:schemaRef ds:uri="http://schemas.microsoft.com/office/infopath/2007/PartnerControls"/>
   </ds:schemaRefs>
 </ds:datastoreItem>
 </file>
@@ -5416,10 +5469,9 @@
 </file>
 
 <file path=customXml/itemProps3.xml><?xml version="1.0" encoding="utf-8"?>
-<ds:datastoreItem xmlns:ds="http://schemas.openxmlformats.org/officeDocument/2006/customXml" ds:itemID="{26BE6D6A-B531-4609-BB00-F52D88A684F2}">
+<ds:datastoreItem xmlns:ds="http://schemas.openxmlformats.org/officeDocument/2006/customXml" ds:itemID="{486DDB34-CE7B-435F-9FCA-D45A5AD28337}">
   <ds:schemaRefs>
-    <ds:schemaRef ds:uri="http://schemas.microsoft.com/office/2006/metadata/properties"/>
-    <ds:schemaRef ds:uri="http://schemas.microsoft.com/office/infopath/2007/PartnerControls"/>
+    <ds:schemaRef ds:uri="http://schemas.microsoft.com/sharepoint/v3/contenttype/forms"/>
   </ds:schemaRefs>
 </ds:datastoreItem>
 </file>
</xml_diff>